<commit_message>
Update combined zh-TW document to include newly split chapters 054-055
</commit_message>
<xml_diff>
--- a/邀月/邀月_zh-TW_合集.docx
+++ b/邀月/邀月_zh-TW_合集.docx
@@ -8130,6 +8130,14 @@
     <w:p/>
     <w:p>
       <w:r>
+        <w:br w:type="page"/>
+      </w:r>
+    </w:p>
+    <w:p>
+      <w:pPr>
+        <w:pStyle w:val="Heading1"/>
+      </w:pPr>
+      <w:r>
         <w:t xml:space="preserve">第十九章　一石三鳥</w:t>
       </w:r>
     </w:p>
@@ -8170,6 +8178,14 @@
     </w:p>
     <w:p/>
     <w:p>
+      <w:r>
+        <w:br w:type="page"/>
+      </w:r>
+    </w:p>
+    <w:p>
+      <w:pPr>
+        <w:pStyle w:val="Heading1"/>
+      </w:pPr>
       <w:r>
         <w:t xml:space="preserve">第二十章　曲終人未散</w:t>
       </w:r>

</xml_diff>